<commit_message>
Initial version 2 with unittests
</commit_message>
<xml_diff>
--- a/backend/app/templates/osvedcenie_z_template.docx
+++ b/backend/app/templates/osvedcenie_z_template.docx
@@ -1089,7 +1089,14 @@
             <w:vAlign w:val="center"/>
           </w:tcPr>
           <w:p>
-            <w:r>
+            <w:pPr>
+              <w:spacing w:before="0" w:after="0" w:line="220" w:lineRule="auto"/>
+            </w:pPr>
+            <w:r>
+              <w:rPr>
+                <w:sz w:val="18"/>
+                <w:szCs w:val="18"/>
+              </w:rPr>
               <w:t>{{ certificate_number }}</w:t>
             </w:r>
           </w:p>
@@ -1204,7 +1211,14 @@
             <w:vAlign w:val="center"/>
           </w:tcPr>
           <w:p>
-            <w:r>
+            <w:pPr>
+              <w:spacing w:before="0" w:after="0" w:line="220" w:lineRule="auto"/>
+            </w:pPr>
+            <w:r>
+              <w:rPr>
+                <w:sz w:val="18"/>
+                <w:szCs w:val="18"/>
+              </w:rPr>
               <w:t>{{ holder_name }}</w:t>
             </w:r>
           </w:p>
@@ -1293,7 +1307,14 @@
             <w:vAlign w:val="center"/>
           </w:tcPr>
           <w:p>
-            <w:r>
+            <w:pPr>
+              <w:spacing w:before="0" w:after="0" w:line="220" w:lineRule="auto"/>
+            </w:pPr>
+            <w:r>
+              <w:rPr>
+                <w:sz w:val="18"/>
+                <w:szCs w:val="18"/>
+              </w:rPr>
               <w:t>{{ holder_street }}</w:t>
             </w:r>
           </w:p>
@@ -1414,7 +1435,14 @@
             <w:vAlign w:val="center"/>
           </w:tcPr>
           <w:p>
-            <w:r>
+            <w:pPr>
+              <w:spacing w:before="0" w:after="0" w:line="220" w:lineRule="auto"/>
+            </w:pPr>
+            <w:r>
+              <w:rPr>
+                <w:sz w:val="18"/>
+                <w:szCs w:val="18"/>
+              </w:rPr>
               <w:t>{{ holder_postal_code }}</w:t>
             </w:r>
           </w:p>
@@ -1491,7 +1519,14 @@
             <w:vAlign w:val="center"/>
           </w:tcPr>
           <w:p>
-            <w:r>
+            <w:pPr>
+              <w:spacing w:before="0" w:after="0" w:line="220" w:lineRule="auto"/>
+            </w:pPr>
+            <w:r>
+              <w:rPr>
+                <w:sz w:val="18"/>
+                <w:szCs w:val="18"/>
+              </w:rPr>
               <w:t>{{ holder_city }}</w:t>
             </w:r>
           </w:p>
@@ -1562,7 +1597,14 @@
             <w:vAlign w:val="center"/>
           </w:tcPr>
           <w:p>
-            <w:r>
+            <w:pPr>
+              <w:spacing w:before="0" w:after="0" w:line="220" w:lineRule="auto"/>
+            </w:pPr>
+            <w:r>
+              <w:rPr>
+                <w:sz w:val="18"/>
+                <w:szCs w:val="18"/>
+              </w:rPr>
               <w:t>{{ holder_country }}</w:t>
             </w:r>
           </w:p>
@@ -1826,7 +1868,14 @@
             <w:vAlign w:val="center"/>
           </w:tcPr>
           <w:p>
-            <w:r>
+            <w:pPr>
+              <w:spacing w:before="0" w:after="0" w:line="220" w:lineRule="auto"/>
+            </w:pPr>
+            <w:r>
+              <w:rPr>
+                <w:sz w:val="18"/>
+                <w:szCs w:val="18"/>
+              </w:rPr>
               <w:t>{{ type_approval_number }}</w:t>
             </w:r>
           </w:p>
@@ -1951,7 +2000,14 @@
             <w:vAlign w:val="center"/>
           </w:tcPr>
           <w:p>
-            <w:r>
+            <w:pPr>
+              <w:spacing w:before="0" w:after="0" w:line="220" w:lineRule="auto"/>
+            </w:pPr>
+            <w:r>
+              <w:rPr>
+                <w:sz w:val="18"/>
+                <w:szCs w:val="18"/>
+              </w:rPr>
               <w:t>{{ tank_manufacturer_name }}</w:t>
             </w:r>
           </w:p>
@@ -2118,7 +2174,14 @@
             <w:vAlign w:val="center"/>
           </w:tcPr>
           <w:p>
-            <w:r>
+            <w:pPr>
+              <w:spacing w:before="0" w:after="0" w:line="220" w:lineRule="auto"/>
+            </w:pPr>
+            <w:r>
+              <w:rPr>
+                <w:sz w:val="18"/>
+                <w:szCs w:val="18"/>
+              </w:rPr>
               <w:t>{{ tank_serial_number }}</w:t>
             </w:r>
           </w:p>
@@ -2243,7 +2306,14 @@
             <w:vAlign w:val="center"/>
           </w:tcPr>
           <w:p>
-            <w:r>
+            <w:pPr>
+              <w:spacing w:before="0" w:after="0" w:line="220" w:lineRule="auto"/>
+            </w:pPr>
+            <w:r>
+              <w:rPr>
+                <w:sz w:val="18"/>
+                <w:szCs w:val="18"/>
+              </w:rPr>
               <w:t>{{ year_of_manufacture }}</w:t>
             </w:r>
           </w:p>
@@ -2499,7 +2569,14 @@
             <w:vAlign w:val="center"/>
           </w:tcPr>
           <w:p>
-            <w:r>
+            <w:pPr>
+              <w:spacing w:before="0" w:after="0" w:line="220" w:lineRule="auto"/>
+            </w:pPr>
+            <w:r>
+              <w:rPr>
+                <w:sz w:val="18"/>
+                <w:szCs w:val="18"/>
+              </w:rPr>
               <w:t>{{ tank_identification }}</w:t>
             </w:r>
           </w:p>
@@ -2521,7 +2598,14 @@
             <w:vAlign w:val="center"/>
           </w:tcPr>
           <w:p>
-            <w:r>
+            <w:pPr>
+              <w:spacing w:before="0" w:after="0" w:line="220" w:lineRule="auto"/>
+            </w:pPr>
+            <w:r>
+              <w:rPr>
+                <w:sz w:val="18"/>
+                <w:szCs w:val="18"/>
+              </w:rPr>
               <w:t>Zvláštne ustanovenia (Special provisions): {{ special_provisions }}</w:t>
             </w:r>
           </w:p>
@@ -2538,7 +2622,14 @@
             <w:vAlign w:val="center"/>
           </w:tcPr>
           <w:p>
-            <w:r>
+            <w:pPr>
+              <w:spacing w:before="0" w:after="0" w:line="220" w:lineRule="auto"/>
+            </w:pPr>
+            <w:r>
+              <w:rPr>
+                <w:sz w:val="18"/>
+                <w:szCs w:val="18"/>
+              </w:rPr>
               <w:t>Kód cisterny (Tank code): {{ tank_code }}</w:t>
             </w:r>
           </w:p>
@@ -3331,7 +3422,14 @@
             <w:vAlign w:val="center"/>
           </w:tcPr>
           <w:p>
-            <w:r>
+            <w:pPr>
+              <w:spacing w:before="0" w:after="0" w:line="220" w:lineRule="auto"/>
+            </w:pPr>
+            <w:r>
+              <w:rPr>
+                <w:sz w:val="18"/>
+                <w:szCs w:val="18"/>
+              </w:rPr>
               <w:t>{{ test_pressure }} bar</w:t>
             </w:r>
           </w:p>
@@ -3480,7 +3578,14 @@
             <w:vAlign w:val="center"/>
           </w:tcPr>
           <w:p>
-            <w:r>
+            <w:pPr>
+              <w:spacing w:before="0" w:after="0" w:line="220" w:lineRule="auto"/>
+            </w:pPr>
+            <w:r>
+              <w:rPr>
+                <w:sz w:val="18"/>
+                <w:szCs w:val="18"/>
+              </w:rPr>
               <w:t>{{ working_pressure }} bar</w:t>
             </w:r>
           </w:p>
@@ -3603,7 +3708,14 @@
             <w:vAlign w:val="center"/>
           </w:tcPr>
           <w:p>
-            <w:r>
+            <w:pPr>
+              <w:spacing w:before="0" w:after="0" w:line="220" w:lineRule="auto"/>
+            </w:pPr>
+            <w:r>
+              <w:rPr>
+                <w:sz w:val="18"/>
+                <w:szCs w:val="18"/>
+              </w:rPr>
               <w:t>{{ calculation_pressure }} bar</w:t>
             </w:r>
           </w:p>
@@ -3877,7 +3989,14 @@
             <w:vAlign w:val="center"/>
           </w:tcPr>
           <w:p>
-            <w:r>
+            <w:pPr>
+              <w:spacing w:before="0" w:after="0" w:line="220" w:lineRule="auto"/>
+            </w:pPr>
+            <w:r>
+              <w:rPr>
+                <w:sz w:val="18"/>
+                <w:szCs w:val="18"/>
+              </w:rPr>
               <w:t>{{ safety_valve_pressure }} bar**</w:t>
             </w:r>
           </w:p>
@@ -4033,7 +4152,14 @@
             <w:vAlign w:val="center"/>
           </w:tcPr>
           <w:p>
-            <w:r>
+            <w:pPr>
+              <w:spacing w:before="0" w:after="0" w:line="220" w:lineRule="auto"/>
+            </w:pPr>
+            <w:r>
+              <w:rPr>
+                <w:sz w:val="18"/>
+                <w:szCs w:val="18"/>
+              </w:rPr>
               <w:t>{{ vacuum_valve_pressure }} bar**</w:t>
             </w:r>
           </w:p>
@@ -4549,7 +4675,14 @@
             <w:vAlign w:val="center"/>
           </w:tcPr>
           <w:p>
-            <w:r>
+            <w:pPr>
+              <w:spacing w:before="0" w:after="0" w:line="220" w:lineRule="auto"/>
+            </w:pPr>
+            <w:r>
+              <w:rPr>
+                <w:sz w:val="18"/>
+                <w:szCs w:val="18"/>
+              </w:rPr>
               <w:t>{{ capacity_liters }}</w:t>
             </w:r>
           </w:p>
@@ -7210,31 +7343,66 @@
             <w:vAlign w:val="center"/>
           </w:tcPr>
           <w:p>
-            <w:r>
+            <w:pPr>
+              <w:spacing w:before="0" w:after="0" w:line="220" w:lineRule="auto"/>
+            </w:pPr>
+            <w:r>
+              <w:rPr>
+                <w:sz w:val="18"/>
+                <w:szCs w:val="18"/>
+              </w:rPr>
               <w:t>Poznámky:</w:t>
               <w:br/>
             </w:r>
           </w:p>
           <w:p>
-            <w:r>
+            <w:pPr>
+              <w:spacing w:before="0" w:after="0" w:line="220" w:lineRule="auto"/>
+            </w:pPr>
+            <w:r>
+              <w:rPr>
+                <w:sz w:val="18"/>
+                <w:szCs w:val="18"/>
+              </w:rPr>
               <w:t>{{ remarks }}</w:t>
               <w:br/>
             </w:r>
           </w:p>
           <w:p>
-            <w:r>
+            <w:pPr>
+              <w:spacing w:before="0" w:after="0" w:line="220" w:lineRule="auto"/>
+            </w:pPr>
+            <w:r>
+              <w:rPr>
+                <w:sz w:val="18"/>
+                <w:szCs w:val="18"/>
+              </w:rPr>
               <w:t>Ložné látky: {{ cargo_substances }}</w:t>
               <w:br/>
             </w:r>
           </w:p>
           <w:p>
-            <w:r>
+            <w:pPr>
+              <w:spacing w:before="0" w:after="0" w:line="220" w:lineRule="auto"/>
+            </w:pPr>
+            <w:r>
+              <w:rPr>
+                <w:sz w:val="18"/>
+                <w:szCs w:val="18"/>
+              </w:rPr>
               <w:t>* Hrúbka skutočne nameraná je uvedená v priloženom protokole.</w:t>
               <w:br/>
             </w:r>
           </w:p>
           <w:p>
-            <w:r>
+            <w:pPr>
+              <w:spacing w:before="0" w:after="0" w:line="220" w:lineRule="auto"/>
+            </w:pPr>
+            <w:r>
+              <w:rPr>
+                <w:sz w:val="18"/>
+                <w:szCs w:val="18"/>
+              </w:rPr>
               <w:t>** Nastavenie poistných ventilov podľa priloženého protokolu.</w:t>
             </w:r>
           </w:p>
@@ -7760,7 +7928,14 @@
             <w:vAlign w:val="center"/>
           </w:tcPr>
           <w:p>
-            <w:r>
+            <w:pPr>
+              <w:spacing w:before="0" w:after="0" w:line="220" w:lineRule="auto"/>
+            </w:pPr>
+            <w:r>
+              <w:rPr>
+                <w:sz w:val="18"/>
+                <w:szCs w:val="18"/>
+              </w:rPr>
               <w:t>{{ tank_plate_stamp }}</w:t>
             </w:r>
           </w:p>
@@ -7925,7 +8100,14 @@
             <w:vAlign w:val="center"/>
           </w:tcPr>
           <w:p>
-            <w:r>
+            <w:pPr>
+              <w:spacing w:before="0" w:after="0" w:line="220" w:lineRule="auto"/>
+            </w:pPr>
+            <w:r>
+              <w:rPr>
+                <w:sz w:val="18"/>
+                <w:szCs w:val="18"/>
+              </w:rPr>
               <w:t>{{ next_inspection }}</w:t>
             </w:r>
           </w:p>
@@ -7947,13 +8129,27 @@
             </w:tcBorders>
           </w:tcPr>
           <w:p>
-            <w:r>
+            <w:pPr>
+              <w:spacing w:before="0" w:after="0" w:line="220" w:lineRule="auto"/>
+            </w:pPr>
+            <w:r>
+              <w:rPr>
+                <w:sz w:val="18"/>
+                <w:szCs w:val="18"/>
+              </w:rPr>
               <w:t>Miesto a dátum kontroly</w:t>
               <w:br/>
             </w:r>
           </w:p>
           <w:p>
-            <w:r>
+            <w:pPr>
+              <w:spacing w:before="0" w:after="0" w:line="220" w:lineRule="auto"/>
+            </w:pPr>
+            <w:r>
+              <w:rPr>
+                <w:sz w:val="18"/>
+                <w:szCs w:val="18"/>
+              </w:rPr>
               <w:t>{{ inspection_place }}, {{ inspection_date }}</w:t>
             </w:r>
           </w:p>
@@ -7970,13 +8166,27 @@
             </w:tcBorders>
           </w:tcPr>
           <w:p>
-            <w:r>
+            <w:pPr>
+              <w:spacing w:before="0" w:after="0" w:line="220" w:lineRule="auto"/>
+            </w:pPr>
+            <w:r>
+              <w:rPr>
+                <w:sz w:val="18"/>
+                <w:szCs w:val="18"/>
+              </w:rPr>
               <w:t>Dátum vydania</w:t>
               <w:br/>
             </w:r>
           </w:p>
           <w:p>
-            <w:r>
+            <w:pPr>
+              <w:spacing w:before="0" w:after="0" w:line="220" w:lineRule="auto"/>
+            </w:pPr>
+            <w:r>
+              <w:rPr>
+                <w:sz w:val="18"/>
+                <w:szCs w:val="18"/>
+              </w:rPr>
               <w:t>{{ inspection_date }}</w:t>
             </w:r>
           </w:p>
@@ -7993,13 +8203,27 @@
             </w:tcBorders>
           </w:tcPr>
           <w:p>
-            <w:r>
+            <w:pPr>
+              <w:spacing w:before="0" w:after="0" w:line="220" w:lineRule="auto"/>
+            </w:pPr>
+            <w:r>
+              <w:rPr>
+                <w:sz w:val="18"/>
+                <w:szCs w:val="18"/>
+              </w:rPr>
               <w:t>Meno inšpektora, podpis a pečiatka</w:t>
               <w:br/>
             </w:r>
           </w:p>
           <w:p>
-            <w:r>
+            <w:pPr>
+              <w:spacing w:before="0" w:after="0" w:line="220" w:lineRule="auto"/>
+            </w:pPr>
+            <w:r>
+              <w:rPr>
+                <w:sz w:val="18"/>
+                <w:szCs w:val="18"/>
+              </w:rPr>
               <w:t>{{ inspector_name }}</w:t>
             </w:r>
           </w:p>

</xml_diff>

<commit_message>
Restyle DOCX templates and compute certificate values
- prvotny: remove stray line break after "Oznacenie cisterny", render
  all placeholder values in bold, use computed last inspection label
- osvedcenie: center value cells, fill "Datum a druh poslednej kontroly"
  as "Periodicka kontrola (P) d.m.yyyy" / "Medzikontrola (L) d.m.yyyy"
  from the P/L dates, and replace fixed 6 mm wall thickness values with
  required (from lookups.xlsx tank type) / measured (from form) pairs
- P/L dates render in Slovak d.m.yyyy format in both documents
- rename measured thickness form labels to "Namerana min. hrubka
  ciel/lubov [mm]"
- add scripts/restyle_templates.py as the repeatable template migration
- bump app shell to v20

Co-Authored-By: Claude Fable 5 <noreply@anthropic.com>
</commit_message>
<xml_diff>
--- a/backend/app/templates/osvedcenie_z_template.docx
+++ b/backend/app/templates/osvedcenie_z_template.docx
@@ -1091,6 +1091,7 @@
           <w:p>
             <w:pPr>
               <w:spacing w:before="0" w:after="0" w:line="220" w:lineRule="auto"/>
+              <w:jc w:val="center"/>
             </w:pPr>
             <w:r>
               <w:rPr>
@@ -1213,6 +1214,7 @@
           <w:p>
             <w:pPr>
               <w:spacing w:before="0" w:after="0" w:line="220" w:lineRule="auto"/>
+              <w:jc w:val="center"/>
             </w:pPr>
             <w:r>
               <w:rPr>
@@ -1309,6 +1311,7 @@
           <w:p>
             <w:pPr>
               <w:spacing w:before="0" w:after="0" w:line="220" w:lineRule="auto"/>
+              <w:jc w:val="center"/>
             </w:pPr>
             <w:r>
               <w:rPr>
@@ -1437,6 +1440,7 @@
           <w:p>
             <w:pPr>
               <w:spacing w:before="0" w:after="0" w:line="220" w:lineRule="auto"/>
+              <w:jc w:val="center"/>
             </w:pPr>
             <w:r>
               <w:rPr>
@@ -1521,6 +1525,7 @@
           <w:p>
             <w:pPr>
               <w:spacing w:before="0" w:after="0" w:line="220" w:lineRule="auto"/>
+              <w:jc w:val="center"/>
             </w:pPr>
             <w:r>
               <w:rPr>
@@ -1599,6 +1604,7 @@
           <w:p>
             <w:pPr>
               <w:spacing w:before="0" w:after="0" w:line="220" w:lineRule="auto"/>
+              <w:jc w:val="center"/>
             </w:pPr>
             <w:r>
               <w:rPr>
@@ -1870,6 +1876,7 @@
           <w:p>
             <w:pPr>
               <w:spacing w:before="0" w:after="0" w:line="220" w:lineRule="auto"/>
+              <w:jc w:val="center"/>
             </w:pPr>
             <w:r>
               <w:rPr>
@@ -2002,6 +2009,7 @@
           <w:p>
             <w:pPr>
               <w:spacing w:before="0" w:after="0" w:line="220" w:lineRule="auto"/>
+              <w:jc w:val="center"/>
             </w:pPr>
             <w:r>
               <w:rPr>
@@ -2176,6 +2184,7 @@
           <w:p>
             <w:pPr>
               <w:spacing w:before="0" w:after="0" w:line="220" w:lineRule="auto"/>
+              <w:jc w:val="center"/>
             </w:pPr>
             <w:r>
               <w:rPr>
@@ -2308,6 +2317,7 @@
           <w:p>
             <w:pPr>
               <w:spacing w:before="0" w:after="0" w:line="220" w:lineRule="auto"/>
+              <w:jc w:val="center"/>
             </w:pPr>
             <w:r>
               <w:rPr>
@@ -2478,6 +2488,13 @@
                 <w:szCs w:val="18"/>
               </w:rPr>
             </w:pPr>
+            <w:r>
+              <w:rPr>
+                <w:sz w:val="18"/>
+                <w:szCs w:val="18"/>
+              </w:rPr>
+              <w:t>{{ last_inspection_label }}</w:t>
+            </w:r>
           </w:p>
         </w:tc>
       </w:tr>
@@ -2571,6 +2588,7 @@
           <w:p>
             <w:pPr>
               <w:spacing w:before="0" w:after="0" w:line="220" w:lineRule="auto"/>
+              <w:jc w:val="center"/>
             </w:pPr>
             <w:r>
               <w:rPr>
@@ -2859,7 +2877,7 @@
                 <w:sz w:val="18"/>
                 <w:szCs w:val="18"/>
               </w:rPr>
-              <w:t>6 mm / *</w:t>
+              <w:t>{{ shell_thickness_required_measured }}</w:t>
             </w:r>
           </w:p>
         </w:tc>
@@ -3086,7 +3104,7 @@
                 <w:sz w:val="18"/>
                 <w:szCs w:val="18"/>
               </w:rPr>
-              <w:t>6 mm / *</w:t>
+              <w:t>{{ head_thickness_required_measured }}</w:t>
             </w:r>
           </w:p>
         </w:tc>
@@ -3424,6 +3442,7 @@
           <w:p>
             <w:pPr>
               <w:spacing w:before="0" w:after="0" w:line="220" w:lineRule="auto"/>
+              <w:jc w:val="center"/>
             </w:pPr>
             <w:r>
               <w:rPr>
@@ -3580,6 +3599,7 @@
           <w:p>
             <w:pPr>
               <w:spacing w:before="0" w:after="0" w:line="220" w:lineRule="auto"/>
+              <w:jc w:val="center"/>
             </w:pPr>
             <w:r>
               <w:rPr>
@@ -3710,6 +3730,7 @@
           <w:p>
             <w:pPr>
               <w:spacing w:before="0" w:after="0" w:line="220" w:lineRule="auto"/>
+              <w:jc w:val="center"/>
             </w:pPr>
             <w:r>
               <w:rPr>
@@ -3991,6 +4012,7 @@
           <w:p>
             <w:pPr>
               <w:spacing w:before="0" w:after="0" w:line="220" w:lineRule="auto"/>
+              <w:jc w:val="center"/>
             </w:pPr>
             <w:r>
               <w:rPr>
@@ -4154,6 +4176,7 @@
           <w:p>
             <w:pPr>
               <w:spacing w:before="0" w:after="0" w:line="220" w:lineRule="auto"/>
+              <w:jc w:val="center"/>
             </w:pPr>
             <w:r>
               <w:rPr>
@@ -4677,6 +4700,7 @@
           <w:p>
             <w:pPr>
               <w:spacing w:before="0" w:after="0" w:line="220" w:lineRule="auto"/>
+              <w:jc w:val="center"/>
             </w:pPr>
             <w:r>
               <w:rPr>
@@ -7358,6 +7382,7 @@
           <w:p>
             <w:pPr>
               <w:spacing w:before="0" w:after="0" w:line="220" w:lineRule="auto"/>
+              <w:jc w:val="center"/>
             </w:pPr>
             <w:r>
               <w:rPr>
@@ -7930,6 +7955,7 @@
           <w:p>
             <w:pPr>
               <w:spacing w:before="0" w:after="0" w:line="220" w:lineRule="auto"/>
+              <w:jc w:val="center"/>
             </w:pPr>
             <w:r>
               <w:rPr>
@@ -8102,6 +8128,7 @@
           <w:p>
             <w:pPr>
               <w:spacing w:before="0" w:after="0" w:line="220" w:lineRule="auto"/>
+              <w:jc w:val="center"/>
             </w:pPr>
             <w:r>
               <w:rPr>
@@ -8144,6 +8171,7 @@
           <w:p>
             <w:pPr>
               <w:spacing w:before="0" w:after="0" w:line="220" w:lineRule="auto"/>
+              <w:jc w:val="center"/>
             </w:pPr>
             <w:r>
               <w:rPr>
@@ -8181,6 +8209,7 @@
           <w:p>
             <w:pPr>
               <w:spacing w:before="0" w:after="0" w:line="220" w:lineRule="auto"/>
+              <w:jc w:val="center"/>
             </w:pPr>
             <w:r>
               <w:rPr>
@@ -8218,6 +8247,7 @@
           <w:p>
             <w:pPr>
               <w:spacing w:before="0" w:after="0" w:line="220" w:lineRule="auto"/>
+              <w:jc w:val="center"/>
             </w:pPr>
             <w:r>
               <w:rPr>

</xml_diff>

<commit_message>
Osvedcenie: inline label formatting and inspection type X mark
- "Zvlastne ustanovenia" / "Kod cisterny" render Slovak bold and the
  English parenthetical italic, matching the rest of the document
- the empty row under "Typ kontroly" gets an X in the column of the
  inspection type selected in the form
- restyle script rebuilds are now idempotent on merged-cell duplicates
  (bold/italic stripped from the copied base run properties)

Co-Authored-By: Claude Fable 5 <noreply@anthropic.com>
</commit_message>
<xml_diff>
--- a/backend/app/templates/osvedcenie_z_template.docx
+++ b/backend/app/templates/osvedcenie_z_template.docx
@@ -2621,10 +2621,26 @@
             </w:pPr>
             <w:r>
               <w:rPr>
-                <w:sz w:val="18"/>
-                <w:szCs w:val="18"/>
-              </w:rPr>
-              <w:t>Zvláštne ustanovenia (Special provisions): {{ special_provisions }}</w:t>
+                <w:b/>
+                <w:sz w:val="18"/>
+                <w:szCs w:val="18"/>
+              </w:rPr>
+              <w:t xml:space="preserve">Zvláštne ustanovenia </w:t>
+            </w:r>
+            <w:r>
+              <w:rPr>
+                <w:i/>
+                <w:sz w:val="18"/>
+                <w:szCs w:val="18"/>
+              </w:rPr>
+              <w:t>(Special provisions):</w:t>
+            </w:r>
+            <w:r>
+              <w:rPr>
+                <w:sz w:val="18"/>
+                <w:szCs w:val="18"/>
+              </w:rPr>
+              <w:t xml:space="preserve"> {{ special_provisions }}</w:t>
             </w:r>
           </w:p>
         </w:tc>
@@ -2645,10 +2661,26 @@
             </w:pPr>
             <w:r>
               <w:rPr>
-                <w:sz w:val="18"/>
-                <w:szCs w:val="18"/>
-              </w:rPr>
-              <w:t>Kód cisterny (Tank code): {{ tank_code }}</w:t>
+                <w:b/>
+                <w:sz w:val="18"/>
+                <w:szCs w:val="18"/>
+              </w:rPr>
+              <w:t xml:space="preserve">Kód cisterny </w:t>
+            </w:r>
+            <w:r>
+              <w:rPr>
+                <w:i/>
+                <w:sz w:val="18"/>
+                <w:szCs w:val="18"/>
+              </w:rPr>
+              <w:t>(Tank code):</w:t>
+            </w:r>
+            <w:r>
+              <w:rPr>
+                <w:sz w:val="18"/>
+                <w:szCs w:val="18"/>
+              </w:rPr>
+              <w:t xml:space="preserve"> {{ tank_code }}</w:t>
             </w:r>
           </w:p>
         </w:tc>
@@ -5509,6 +5541,16 @@
                 <w:szCs w:val="18"/>
               </w:rPr>
             </w:pPr>
+            <w:r>
+              <w:rPr>
+                <w:rFonts w:cstheme="minorHAnsi"/>
+                <w:b/>
+                <w:bCs/>
+                <w:sz w:val="18"/>
+                <w:szCs w:val="18"/>
+              </w:rPr>
+              <w:t>{{ inspection_type_initial_mark }}</w:t>
+            </w:r>
           </w:p>
         </w:tc>
         <w:tc>
@@ -5532,6 +5574,16 @@
                 <w:szCs w:val="18"/>
               </w:rPr>
             </w:pPr>
+            <w:r>
+              <w:rPr>
+                <w:rFonts w:cstheme="minorHAnsi"/>
+                <w:b/>
+                <w:bCs/>
+                <w:sz w:val="18"/>
+                <w:szCs w:val="18"/>
+              </w:rPr>
+              <w:t>{{ inspection_type_periodic_mark }}</w:t>
+            </w:r>
           </w:p>
         </w:tc>
         <w:tc>
@@ -5556,6 +5608,16 @@
                 <w:szCs w:val="18"/>
               </w:rPr>
             </w:pPr>
+            <w:r>
+              <w:rPr>
+                <w:rFonts w:cstheme="minorHAnsi"/>
+                <w:b/>
+                <w:bCs/>
+                <w:sz w:val="18"/>
+                <w:szCs w:val="18"/>
+              </w:rPr>
+              <w:t>{{ inspection_type_intermediate_mark }}</w:t>
+            </w:r>
           </w:p>
         </w:tc>
         <w:tc>
@@ -5579,6 +5641,16 @@
                 <w:szCs w:val="18"/>
               </w:rPr>
             </w:pPr>
+            <w:r>
+              <w:rPr>
+                <w:rFonts w:cstheme="minorHAnsi"/>
+                <w:b/>
+                <w:bCs/>
+                <w:sz w:val="18"/>
+                <w:szCs w:val="18"/>
+              </w:rPr>
+              <w:t>{{ inspection_type_exceptional_mark }}</w:t>
+            </w:r>
           </w:p>
         </w:tc>
       </w:tr>

</xml_diff>